<commit_message>
Learn C# for Beginners
</commit_message>
<xml_diff>
--- a/ghi-chu.docx
+++ b/ghi-chu.docx
@@ -5425,6 +5425,7 @@
       <w:r>
         <w:rPr>
           <w:rFonts w:cs="Times New Roman"/>
+          <w:noProof/>
           <w:szCs w:val="26"/>
         </w:rPr>
         <w:drawing>
@@ -5538,6 +5539,7 @@
           <w:rFonts w:cs="Times New Roman"/>
           <w:b/>
           <w:bCs/>
+          <w:noProof/>
           <w:sz w:val="32"/>
           <w:szCs w:val="32"/>
         </w:rPr>
@@ -5594,6 +5596,7 @@
           <w:rFonts w:cs="Times New Roman"/>
           <w:b/>
           <w:bCs/>
+          <w:noProof/>
           <w:sz w:val="32"/>
           <w:szCs w:val="32"/>
         </w:rPr>
@@ -5694,6 +5697,7 @@
           <w:rFonts w:cs="Times New Roman"/>
           <w:b/>
           <w:bCs/>
+          <w:noProof/>
           <w:sz w:val="32"/>
           <w:szCs w:val="32"/>
         </w:rPr>
@@ -5732,6 +5736,104 @@
             </a:graphic>
           </wp:inline>
         </w:drawing>
+      </w:r>
+    </w:p>
+    <w:p>
+      <w:pPr>
+        <w:rPr>
+          <w:rFonts w:cs="Times New Roman"/>
+          <w:b/>
+          <w:bCs/>
+          <w:sz w:val="32"/>
+          <w:szCs w:val="32"/>
+        </w:rPr>
+      </w:pPr>
+      <w:r>
+        <w:rPr>
+          <w:rFonts w:cs="Times New Roman"/>
+          <w:b/>
+          <w:bCs/>
+          <w:sz w:val="32"/>
+          <w:szCs w:val="32"/>
+        </w:rPr>
+        <w:br w:type="page"/>
+      </w:r>
+    </w:p>
+    <w:p>
+      <w:pPr>
+        <w:pStyle w:val="NoSpacing"/>
+      </w:pPr>
+      <w:r>
+        <w:lastRenderedPageBreak/>
+        <w:t>Methods</w:t>
+      </w:r>
+    </w:p>
+    <w:p>
+      <w:pPr>
+        <w:pStyle w:val="NoSpacing"/>
+      </w:pPr>
+      <w:r>
+        <w:drawing>
+          <wp:inline distT="0" distB="0" distL="0" distR="0" wp14:anchorId="46C806B3" wp14:editId="183E83AF">
+            <wp:extent cx="5943600" cy="4445000"/>
+            <wp:effectExtent l="0" t="0" r="0" b="0"/>
+            <wp:docPr id="793188121" name="Picture 1"/>
+            <wp:cNvGraphicFramePr>
+              <a:graphicFrameLocks xmlns:a="http://schemas.openxmlformats.org/drawingml/2006/main" noChangeAspect="1"/>
+            </wp:cNvGraphicFramePr>
+            <a:graphic xmlns:a="http://schemas.openxmlformats.org/drawingml/2006/main">
+              <a:graphicData uri="http://schemas.openxmlformats.org/drawingml/2006/picture">
+                <pic:pic xmlns:pic="http://schemas.openxmlformats.org/drawingml/2006/picture">
+                  <pic:nvPicPr>
+                    <pic:cNvPr id="793188121" name=""/>
+                    <pic:cNvPicPr/>
+                  </pic:nvPicPr>
+                  <pic:blipFill>
+                    <a:blip r:embed="rId30"/>
+                    <a:stretch>
+                      <a:fillRect/>
+                    </a:stretch>
+                  </pic:blipFill>
+                  <pic:spPr>
+                    <a:xfrm>
+                      <a:off x="0" y="0"/>
+                      <a:ext cx="5943600" cy="4445000"/>
+                    </a:xfrm>
+                    <a:prstGeom prst="rect">
+                      <a:avLst/>
+                    </a:prstGeom>
+                  </pic:spPr>
+                </pic:pic>
+              </a:graphicData>
+            </a:graphic>
+          </wp:inline>
+        </w:drawing>
+      </w:r>
+    </w:p>
+    <w:p/>
+    <w:p>
+      <w:pPr>
+        <w:rPr>
+          <w:b/>
+          <w:bCs/>
+          <w:color w:val="EE0000"/>
+        </w:rPr>
+      </w:pPr>
+      <w:r>
+        <w:rPr>
+          <w:b/>
+          <w:bCs/>
+          <w:color w:val="EE0000"/>
+        </w:rPr>
+        <w:t xml:space="preserve">Static: </w:t>
+      </w:r>
+      <w:r>
+        <w:rPr>
+          <w:b/>
+          <w:bCs/>
+          <w:color w:val="EE0000"/>
+        </w:rPr>
+        <w:t>static chỉ làm việc với những thứ cũng thuộc static hoặc những thứ được truyền vào.</w:t>
       </w:r>
     </w:p>
     <w:p/>
@@ -7138,7 +7240,6 @@
   <w:style w:type="character" w:default="1" w:styleId="DefaultParagraphFont">
     <w:name w:val="Default Paragraph Font"/>
     <w:uiPriority w:val="1"/>
-    <w:semiHidden/>
     <w:unhideWhenUsed/>
   </w:style>
   <w:style w:type="table" w:default="1" w:styleId="TableNormal">

</xml_diff>